<commit_message>
Finalize EduPredict: fix documentation, validate experiments, and update tests
</commit_message>
<xml_diff>
--- a/deliverables/EduPredict_Final_Project_Report.docx
+++ b/deliverables/EduPredict_Final_Project_Report.docx
@@ -128,7 +128,7 @@
           <w:color w:val="0F172A"/>
           <w:sz w:val="22"/>
         </w:rPr>
-        <w:t>EduPredict is formulated around the benchmark UCI Student Performance Mathematics dataset (Cortez and Silva, 2008), comprising 395 student records with 33 attributes spanning demographic background, family structure, study habits, lifestyle, and social factors. To enforce rigorous real-world pedagogical validity and eliminate data leakage, intermediate examination grades (G1 and G2) are strictly excluded from the feature space, requiring models to predict performance early in the semester before examination signals exist. The framework simultaneously tackles two distinct tasks: (1) continuous final grade regression (G3 in [0, 20]), and (2) early academic risk classification (academic_risk = 1 if G3 &lt; 10, else 0). Three classical model families are implemented from scratch: Custom Linear Regression (with closed-form Normal Equation and iterative Gradient Descent solvers), Custom K-Nearest Neighbors Classifier, and Custom CART Decision Tree Classifier.</w:t>
+        <w:t>EduPredict is formulated around the benchmark UCI Student Performance Mathematics dataset (Cortez and Silva, 2008), comprising 395 student records with 33 attributes spanning demographic background, family structure, study habits, lifestyle, and social factors. To enforce rigorous pedagogical validity and operational early-warning utility around the standard Portuguese passing threshold (G3 &gt;= 10), intermediate examination grades (G1 and G2) are strictly excluded from the feature space, requiring models to predict performance early in the semester before examination signals exist. The framework simultaneously tackles two distinct tasks: (1) continuous final grade regression (G3 in [0, 20]), and (2) early academic risk classification (academic_risk = 1 if G3 &lt; 10, else 0). Three classical model families are implemented from scratch: Custom Linear Regression (with closed-form Normal Equation and iterative Gradient Descent solvers), Custom K-Nearest Neighbors Classifier, and Custom CART Decision Tree Classifier.</w:t>
       </w:r>
     </w:p>
     <w:p>
@@ -143,7 +143,7 @@
           <w:color w:val="0F172A"/>
           <w:sz w:val="22"/>
         </w:rPr>
-        <w:t>Using a strictly isolated 3-way partition protocol (79-sample untouched holdout test set, and a 316-sample development pool partitioned into 253 training-subset and 63 validation samples), hyperparameters were selected on validation data without test-set peeking. On the holdout test set, regularized Linear Regression (lambda = 5.0) achieved an MSE of 15.5334 (RMSE 3.9412, MAE 2.9036, R² = +0.0600), outperforming the training-mean baseline (MSE 16.5264, R² = -0.0001). For classification, the pruned Decision Tree (max_depth = 2) achieved 69.62% test accuracy, 0.5500 precision, 0.4231 recall (identifying 11 of 26 at-risk students), F1 = 0.4783, and ROC-AUC = 0.6161, outperforming both the majority-class baseline (67.09% accuracy, 0.0 recall) and unpruned trees (test ROC-AUC 0.4989). All code, metrics, and interactive dashboard components are verified through an automated 110-test suite and verified AST compliance scanning.</w:t>
+        <w:t>Using a strictly isolated 3-way partition protocol (79-sample untouched holdout test set, and a 316-sample development pool partitioned into 253 training-subset and 63 validation samples), hyperparameters were selected on validation data without test-set peeking. On the holdout test set, regularized Linear Regression (lambda = 5.0) achieved an MSE of 15.5334 (RMSE 3.9412, MAE 2.9036, R² = +0.0600), outperforming the training-mean baseline (MSE 16.5264, R² = -0.0001). For classification, the pruned Decision Tree (max_depth = 2) achieved 69.62% test accuracy, 0.5500 precision, 0.4231 recall (identifying 11 of 26 at-risk students), F1 = 0.4783, and ROC-AUC = 0.6161, outperforming both the majority-class baseline (67.09% accuracy, 0.0 recall) and unpruned trees (test ROC-AUC 0.4989). All code, metrics, and interactive dashboard components are verified through an automated 117-test suite and verified AST compliance scanning.</w:t>
       </w:r>
     </w:p>
     <w:p>
@@ -3126,8 +3126,6 @@
         <w:br/>
         <w:t>|   |-- student-mat.csv               &lt;- Primary UCI Mathematics dataset (395 records)</w:t>
         <w:br/>
-        <w:t>|   +-- student_performance.csv       &lt;- Auxiliary synthetic benchmark dataset</w:t>
-        <w:br/>
         <w:t>|-- edupredict/</w:t>
         <w:br/>
         <w:t>|   |-- math/                         &lt;- Scratch Linear Algebra, Statistics, and Exp/Log</w:t>
@@ -3186,7 +3184,7 @@
         <w:br/>
         <w:t>|   +-- visualization/                &lt;- Matplotlib rendering wrappers (presentation only)</w:t>
         <w:br/>
-        <w:t>|-- tests/                           &lt;- Comprehensive unittest verification suite (110 tests)</w:t>
+        <w:t>|-- tests/                           &lt;- Comprehensive unittest verification suite (117 tests)</w:t>
         <w:br/>
         <w:t>|   |-- test_dependency_compliance.py &lt;- AST scanner verifying zero external library imports</w:t>
         <w:br/>
@@ -6957,7 +6955,7 @@
           <w:color w:val="0F172A"/>
           <w:sz w:val="22"/>
         </w:rPr>
-        <w:t>Varying neighbor count k from 1 to 29 highlights neighborhood variance: At k = 1, training accuracy is 100% (memorization), but validation accuracy is low (~63.5%) due to sensitivity to outliers. Increasing k averages local noise, with validation accuracy peaking at k = 19 (66.67%). At large k (k &gt; 25), boundaries become overly smooth, predicting global class frequencies (high bias).</w:t>
+        <w:t>Varying neighbor count k from 1 to 29 highlights neighborhood variance: At k = 1, training accuracy is 100% (memorization), but validation accuracy is low (~63.5%) due to sensitivity to outliers. Increasing k averages local noise, with validation accuracy peaking at k = 19 (66.67% on the Train-Sub/Validation split). However, due to class imbalance (~67% normal vs. 33% at-risk), large k induces majority-smoothing where the classifier predominantly assigns the majority class, collapsing holdout recall to 7.69%. Consequently, k = 5 is evaluated in the benchmark suite as the canonical non-parametric comparison baseline (64.56% holdout accuracy, 0.5653 ROC-AUC), while Decision Tree (max_depth = 2) is selected as the primary risk classifier.</w:t>
       </w:r>
     </w:p>
     <w:p>
@@ -7042,7 +7040,7 @@
           <w:color w:val="0F172A"/>
           <w:sz w:val="22"/>
         </w:rPr>
-        <w:t>Evaluating lambda across [0, 100] demonstrates shrinkage dynamics: At lambda = 0, collinear one-hot columns inflate variance (R² &lt; 0). At lambda = 5.0, validation R² peaks at +0.0431 and holdout R² reaches +0.0600. Excessively large penalties (lambda &gt; 50) push all coefficients to zero, underfitting the model toward the global target mean.</w:t>
+        <w:t>Evaluating lambda across [0, 100] demonstrates shrinkage dynamics: At lambda = 0, collinear one-hot columns inflate variance (R² &lt; 0). At lambda = 5.0, validation R² peaks at +0.0423 and holdout R² reaches +0.0600. Excessively large penalties (lambda &gt; 50) push all coefficients to zero, underfitting the model toward the global target mean.</w:t>
       </w:r>
     </w:p>
     <w:p>
@@ -7199,7 +7197,7 @@
           <w:color w:val="0F172A"/>
           <w:sz w:val="22"/>
         </w:rPr>
-        <w:t>Software testing is conducted using Python's standard unittest framework (strictly zero third-party test dependencies like pytest). The automated test suite comprises exactly 110 unit and integration tests executing in ~13.3 seconds with 100% pass rate:</w:t>
+        <w:t>Software testing is conducted using Python's standard unittest framework (strictly zero third-party test dependencies like pytest). The automated test suite comprises exactly 117 unit and integration tests executing in ~8 seconds with 100% pass rate (0 skipped, 0 failures, 0 errors):</w:t>
       </w:r>
     </w:p>
     <w:tbl>
@@ -7495,7 +7493,7 @@
                 <w:color w:val="1E293B"/>
                 <w:sz w:val="19"/>
               </w:rPr>
-              <w:t>8</w:t>
+              <w:t>7</w:t>
             </w:r>
           </w:p>
         </w:tc>
@@ -7572,7 +7570,7 @@
                 <w:color w:val="1E293B"/>
                 <w:sz w:val="19"/>
               </w:rPr>
-              <w:t>7</w:t>
+              <w:t>10</w:t>
             </w:r>
           </w:p>
         </w:tc>
@@ -7726,7 +7724,7 @@
                 <w:color w:val="1E293B"/>
                 <w:sz w:val="19"/>
               </w:rPr>
-              <w:t>8</w:t>
+              <w:t>7</w:t>
             </w:r>
           </w:p>
         </w:tc>
@@ -7880,7 +7878,7 @@
                 <w:color w:val="1E293B"/>
                 <w:sz w:val="19"/>
               </w:rPr>
-              <w:t>9</w:t>
+              <w:t>6</w:t>
             </w:r>
           </w:p>
         </w:tc>
@@ -7957,7 +7955,7 @@
                 <w:color w:val="1E293B"/>
                 <w:sz w:val="19"/>
               </w:rPr>
-              <w:t>11</w:t>
+              <w:t>8</w:t>
             </w:r>
           </w:p>
         </w:tc>
@@ -8188,7 +8186,7 @@
                 <w:color w:val="1E293B"/>
                 <w:sz w:val="19"/>
               </w:rPr>
-              <w:t>10</w:t>
+              <w:t>5</w:t>
             </w:r>
           </w:p>
         </w:tc>
@@ -8213,7 +8211,7 @@
                 <w:color w:val="1E293B"/>
                 <w:sz w:val="19"/>
               </w:rPr>
-              <w:t>Anti-leakage feature isolation, stratification alignment across targets</w:t>
+              <w:t>Anti-leakage feature isolation, split stratification, and student-mat verification</w:t>
             </w:r>
           </w:p>
         </w:tc>
@@ -8265,7 +8263,7 @@
                 <w:color w:val="1E293B"/>
                 <w:sz w:val="19"/>
               </w:rPr>
-              <w:t>6</w:t>
+              <w:t>5</w:t>
             </w:r>
           </w:p>
         </w:tc>
@@ -8291,6 +8289,160 @@
                 <w:sz w:val="19"/>
               </w:rPr>
               <w:t>KFold, StratifiedKFold, and joint-index train_test_split verification</w:t>
+            </w:r>
+          </w:p>
+        </w:tc>
+      </w:tr>
+      <w:tr>
+        <w:tc>
+          <w:tcPr>
+            <w:tcW w:type="dxa" w:w="3168"/>
+            <w:shd w:val="clear" w:color="auto" w:fill="F8FAFC"/>
+            <w:tcMar>
+              <w:top w:w="80" w:type="dxa"/>
+              <w:bottom w:w="80" w:type="dxa"/>
+              <w:left w:w="120" w:type="dxa"/>
+              <w:right w:w="120" w:type="dxa"/>
+            </w:tcMar>
+          </w:tcPr>
+          <w:p>
+            <w:pPr>
+              <w:jc w:val="left"/>
+            </w:pPr>
+            <w:r>
+              <w:rPr>
+                <w:rFonts w:ascii="Times New Roman" w:hAnsi="Times New Roman"/>
+                <w:color w:val="1E293B"/>
+                <w:sz w:val="19"/>
+              </w:rPr>
+              <w:t>test_optimization.py</w:t>
+            </w:r>
+          </w:p>
+        </w:tc>
+        <w:tc>
+          <w:tcPr>
+            <w:tcW w:type="dxa" w:w="864"/>
+            <w:shd w:val="clear" w:color="auto" w:fill="F8FAFC"/>
+            <w:tcMar>
+              <w:top w:w="80" w:type="dxa"/>
+              <w:bottom w:w="80" w:type="dxa"/>
+              <w:left w:w="120" w:type="dxa"/>
+              <w:right w:w="120" w:type="dxa"/>
+            </w:tcMar>
+          </w:tcPr>
+          <w:p>
+            <w:pPr>
+              <w:jc w:val="center"/>
+            </w:pPr>
+            <w:r>
+              <w:rPr>
+                <w:rFonts w:ascii="Times New Roman" w:hAnsi="Times New Roman"/>
+                <w:color w:val="1E293B"/>
+                <w:sz w:val="19"/>
+              </w:rPr>
+              <w:t>5</w:t>
+            </w:r>
+          </w:p>
+        </w:tc>
+        <w:tc>
+          <w:tcPr>
+            <w:tcW w:type="dxa" w:w="5328"/>
+            <w:shd w:val="clear" w:color="auto" w:fill="F8FAFC"/>
+            <w:tcMar>
+              <w:top w:w="80" w:type="dxa"/>
+              <w:bottom w:w="80" w:type="dxa"/>
+              <w:left w:w="120" w:type="dxa"/>
+              <w:right w:w="120" w:type="dxa"/>
+            </w:tcMar>
+          </w:tcPr>
+          <w:p>
+            <w:pPr>
+              <w:jc w:val="center"/>
+            </w:pPr>
+            <w:r>
+              <w:rPr>
+                <w:rFonts w:ascii="Times New Roman" w:hAnsi="Times New Roman"/>
+                <w:color w:val="1E293B"/>
+                <w:sz w:val="19"/>
+              </w:rPr>
+              <w:t>Mini-batch gradient descent with Polyak momentum and convergence checks</w:t>
+            </w:r>
+          </w:p>
+        </w:tc>
+      </w:tr>
+      <w:tr>
+        <w:tc>
+          <w:tcPr>
+            <w:tcW w:type="dxa" w:w="3168"/>
+            <w:shd w:val="clear" w:color="auto" w:fill="FFFFFF"/>
+            <w:tcMar>
+              <w:top w:w="80" w:type="dxa"/>
+              <w:bottom w:w="80" w:type="dxa"/>
+              <w:left w:w="120" w:type="dxa"/>
+              <w:right w:w="120" w:type="dxa"/>
+            </w:tcMar>
+          </w:tcPr>
+          <w:p>
+            <w:pPr>
+              <w:jc w:val="left"/>
+            </w:pPr>
+            <w:r>
+              <w:rPr>
+                <w:rFonts w:ascii="Times New Roman" w:hAnsi="Times New Roman"/>
+                <w:color w:val="1E293B"/>
+                <w:sz w:val="19"/>
+              </w:rPr>
+              <w:t>test_multiclass.py</w:t>
+            </w:r>
+          </w:p>
+        </w:tc>
+        <w:tc>
+          <w:tcPr>
+            <w:tcW w:type="dxa" w:w="864"/>
+            <w:shd w:val="clear" w:color="auto" w:fill="FFFFFF"/>
+            <w:tcMar>
+              <w:top w:w="80" w:type="dxa"/>
+              <w:bottom w:w="80" w:type="dxa"/>
+              <w:left w:w="120" w:type="dxa"/>
+              <w:right w:w="120" w:type="dxa"/>
+            </w:tcMar>
+          </w:tcPr>
+          <w:p>
+            <w:pPr>
+              <w:jc w:val="center"/>
+            </w:pPr>
+            <w:r>
+              <w:rPr>
+                <w:rFonts w:ascii="Times New Roman" w:hAnsi="Times New Roman"/>
+                <w:color w:val="1E293B"/>
+                <w:sz w:val="19"/>
+              </w:rPr>
+              <w:t>2</w:t>
+            </w:r>
+          </w:p>
+        </w:tc>
+        <w:tc>
+          <w:tcPr>
+            <w:tcW w:type="dxa" w:w="5328"/>
+            <w:shd w:val="clear" w:color="auto" w:fill="FFFFFF"/>
+            <w:tcMar>
+              <w:top w:w="80" w:type="dxa"/>
+              <w:bottom w:w="80" w:type="dxa"/>
+              <w:left w:w="120" w:type="dxa"/>
+              <w:right w:w="120" w:type="dxa"/>
+            </w:tcMar>
+          </w:tcPr>
+          <w:p>
+            <w:pPr>
+              <w:jc w:val="center"/>
+            </w:pPr>
+            <w:r>
+              <w:rPr>
+                <w:rFonts w:ascii="Times New Roman" w:hAnsi="Times New Roman"/>
+                <w:color w:val="1E293B"/>
+                <w:sz w:val="19"/>
+              </w:rPr>
+              <w:t>One-vs-Rest multiclass classifier wrapper and decision routing</w:t>
             </w:r>
           </w:p>
         </w:tc>
@@ -8419,7 +8571,7 @@
                 <w:color w:val="1E293B"/>
                 <w:sz w:val="19"/>
               </w:rPr>
-              <w:t>4</w:t>
+              <w:t>11</w:t>
             </w:r>
           </w:p>
         </w:tc>
@@ -8444,7 +8596,7 @@
                 <w:color w:val="1E293B"/>
                 <w:sz w:val="19"/>
               </w:rPr>
-              <w:t>Programmatic verification of all 6 dashboard tab data flows and prediction paths</w:t>
+              <w:t>Programmatic verification of all 6 dashboard tab data flows, health check, and prediction paths</w:t>
             </w:r>
           </w:p>
         </w:tc>

</xml_diff>